<commit_message>
feat(portfolio): update CV, refactor resume/about/skills sections, improve styling and add assets
</commit_message>
<xml_diff>
--- a/src/assets/documents/cv/myCV_v8.docx
+++ b/src/assets/documents/cv/myCV_v8.docx
@@ -43,7 +43,7 @@
           <w:b/>
           <w:bCs/>
         </w:rPr>
-        <w:t xml:space="preserve">Full-Stack Junior Developer | </w:t>
+        <w:t xml:space="preserve">Full-Stack Developer | </w:t>
       </w:r>
       <w:r>
         <w:rPr>
@@ -260,7 +260,7 @@
           <w:sz w:val="20"/>
           <w:szCs w:val="20"/>
         </w:rPr>
-        <w:t>Full-Stack Junior Developer with 3+ years of experience in application development, building scalable, mobile-first web applications and API-driven systems. Strong expertise in JavaScript, React, Node.js, and MySQL, with hands-on experience delivering maintainable code from concept to deployment. Experienced in collaborating, participating in code reviews, troubleshooting issues, and continuously learning new technologies in fast-paced environments.</w:t>
+        <w:t>Full-Stack Developer with 3+ years of experience in application development, building scalable, mobile-first web applications and API-driven systems. Strong expertise in JavaScript, React, Node.js, and MySQL, with hands-on experience delivering maintainable code from concept to deployment. Experienced in collaborating, participating in code reviews, troubleshooting issues, and continuously learning new technologies in fast-paced environments.</w:t>
       </w:r>
     </w:p>
     <w:p>
@@ -1504,8 +1504,39 @@
           <w:szCs w:val="20"/>
           <w:lang w:val="en-GB"/>
         </w:rPr>
-        <w:t>Developed a map-based web application using multiple third-party APIs (Geonames, OpenWeather</w:t>
-      </w:r>
+        <w:t>Developed a map-based web application using multiple third-party APIs (</w:t>
+      </w:r>
+      <w:proofErr w:type="spellStart"/>
+      <w:r>
+        <w:rPr>
+          <w:rFonts w:ascii="Arial" w:hAnsi="Arial" w:cs="Arial"/>
+          <w:sz w:val="20"/>
+          <w:szCs w:val="20"/>
+          <w:lang w:val="en-GB"/>
+        </w:rPr>
+        <w:t>Geonames</w:t>
+      </w:r>
+      <w:proofErr w:type="spellEnd"/>
+      <w:r>
+        <w:rPr>
+          <w:rFonts w:ascii="Arial" w:hAnsi="Arial" w:cs="Arial"/>
+          <w:sz w:val="20"/>
+          <w:szCs w:val="20"/>
+          <w:lang w:val="en-GB"/>
+        </w:rPr>
+        <w:t xml:space="preserve">, </w:t>
+      </w:r>
+      <w:proofErr w:type="spellStart"/>
+      <w:r>
+        <w:rPr>
+          <w:rFonts w:ascii="Arial" w:hAnsi="Arial" w:cs="Arial"/>
+          <w:sz w:val="20"/>
+          <w:szCs w:val="20"/>
+          <w:lang w:val="en-GB"/>
+        </w:rPr>
+        <w:t>OpenWeather</w:t>
+      </w:r>
+      <w:proofErr w:type="spellEnd"/>
       <w:r>
         <w:rPr>
           <w:rFonts w:ascii="Arial" w:hAnsi="Arial" w:cs="Arial"/>

</xml_diff>

<commit_message>
Sync downloadable CV to the Resume section
</commit_message>
<xml_diff>
--- a/src/assets/documents/cv/myCV_v8.docx
+++ b/src/assets/documents/cv/myCV_v8.docx
@@ -265,15 +265,11 @@
     </w:p>
     <w:p>
       <w:pPr>
-        <w:pBdr>
-          <w:top w:val="single" w:sz="12" w:space="1" w:color="BFBFBF" w:themeColor="background1" w:themeShade="BF"/>
-        </w:pBdr>
-        <w:spacing w:line="276" w:lineRule="auto"/>
-        <w:rPr>
-          <w:rFonts w:ascii="Arial" w:hAnsi="Arial" w:cs="Arial"/>
-          <w:sz w:val="12"/>
-          <w:szCs w:val="12"/>
-          <w:lang w:val="en-AU"/>
+        <w:spacing w:after="200"/>
+        <w:rPr>
+          <w:rFonts w:ascii="Arial" w:hAnsi="Arial" w:cs="Arial"/>
+          <w:sz w:val="20"/>
+          <w:szCs w:val="20"/>
         </w:rPr>
       </w:pPr>
     </w:p>
@@ -323,7 +319,7 @@
           <w:sz w:val="20"/>
           <w:szCs w:val="20"/>
         </w:rPr>
-        <w:t>HTML5, CSS3, Sass, Bootstrap, JavaScript (ES6+), React, jQuery</w:t>
+        <w:t>Redux, Next.js, TypeScript, JavaScript, HTML, CSS, Sass</w:t>
       </w:r>
     </w:p>
     <w:p>
@@ -359,7 +355,7 @@
           <w:sz w:val="20"/>
           <w:szCs w:val="20"/>
         </w:rPr>
-        <w:t>Node.js, Express.js, PHP, Python, REST APIs</w:t>
+        <w:t>Node.js, Express, Python</w:t>
       </w:r>
     </w:p>
     <w:p>
@@ -395,7 +391,43 @@
           <w:sz w:val="20"/>
           <w:szCs w:val="20"/>
         </w:rPr>
-        <w:t>MySQL</w:t>
+        <w:t>PostgreSQL, MongoDB</w:t>
+      </w:r>
+    </w:p>
+    <w:p>
+      <w:pPr>
+        <w:spacing w:after="120" w:line="276" w:lineRule="auto"/>
+        <w:rPr>
+          <w:rFonts w:ascii="Arial" w:hAnsi="Arial" w:cs="Arial"/>
+          <w:sz w:val="20"/>
+          <w:szCs w:val="20"/>
+        </w:rPr>
+      </w:pPr>
+      <w:r>
+        <w:rPr>
+          <w:rFonts w:ascii="Arial" w:hAnsi="Arial" w:cs="Arial"/>
+          <w:b/>
+          <w:bCs/>
+          <w:sz w:val="20"/>
+          <w:szCs w:val="20"/>
+        </w:rPr>
+        <w:t>DevOps &amp; Tools:</w:t>
+      </w:r>
+      <w:r>
+        <w:rPr>
+          <w:rFonts w:ascii="Arial" w:hAnsi="Arial" w:cs="Arial"/>
+          <w:sz w:val="20"/>
+          <w:szCs w:val="20"/>
+        </w:rPr>
+        <w:t xml:space="preserve"> </w:t>
+      </w:r>
+      <w:r>
+        <w:rPr>
+          <w:rFonts w:ascii="Arial" w:hAnsi="Arial" w:cs="Arial"/>
+          <w:sz w:val="20"/>
+          <w:szCs w:val="20"/>
+        </w:rPr>
+        <w:t>CI/CD, GitHub Actions</w:t>
       </w:r>
       <w:r>
         <w:rPr>
@@ -411,7 +443,7 @@
           <w:sz w:val="20"/>
           <w:szCs w:val="20"/>
         </w:rPr>
-        <w:t>MongoDB, SQL</w:t>
+        <w:t>Git, GitHub</w:t>
       </w:r>
     </w:p>
     <w:p>
@@ -431,15 +463,33 @@
           <w:sz w:val="20"/>
           <w:szCs w:val="20"/>
         </w:rPr>
-        <w:t>DevOps &amp; Tools:</w:t>
-      </w:r>
-      <w:r>
-        <w:rPr>
-          <w:rFonts w:ascii="Arial" w:hAnsi="Arial" w:cs="Arial"/>
-          <w:sz w:val="20"/>
-          <w:szCs w:val="20"/>
-        </w:rPr>
-        <w:t xml:space="preserve"> Git, GitHub, VPS, Firebase, Heroku, Hostinger</w:t>
+        <w:t>Workflow</w:t>
+      </w:r>
+      <w:r>
+        <w:rPr>
+          <w:rFonts w:ascii="Arial" w:hAnsi="Arial" w:cs="Arial"/>
+          <w:b/>
+          <w:bCs/>
+          <w:sz w:val="20"/>
+          <w:szCs w:val="20"/>
+        </w:rPr>
+        <w:t>:</w:t>
+      </w:r>
+      <w:r>
+        <w:rPr>
+          <w:rFonts w:ascii="Arial" w:hAnsi="Arial" w:cs="Arial"/>
+          <w:sz w:val="20"/>
+          <w:szCs w:val="20"/>
+        </w:rPr>
+        <w:t xml:space="preserve"> </w:t>
+      </w:r>
+      <w:r>
+        <w:rPr>
+          <w:rFonts w:ascii="Arial" w:hAnsi="Arial" w:cs="Arial"/>
+          <w:sz w:val="20"/>
+          <w:szCs w:val="20"/>
+        </w:rPr>
+        <w:t>AI-Assisted Development</w:t>
       </w:r>
     </w:p>
     <w:p>
@@ -449,38 +499,6 @@
           <w:rFonts w:ascii="Arial" w:hAnsi="Arial" w:cs="Arial"/>
           <w:sz w:val="20"/>
           <w:szCs w:val="20"/>
-        </w:rPr>
-      </w:pPr>
-      <w:r>
-        <w:rPr>
-          <w:rFonts w:ascii="Arial" w:hAnsi="Arial" w:cs="Arial"/>
-          <w:b/>
-          <w:bCs/>
-          <w:sz w:val="20"/>
-          <w:szCs w:val="20"/>
-        </w:rPr>
-        <w:t>Methodologies:</w:t>
-      </w:r>
-      <w:r>
-        <w:rPr>
-          <w:rFonts w:ascii="Arial" w:hAnsi="Arial" w:cs="Arial"/>
-          <w:sz w:val="20"/>
-          <w:szCs w:val="20"/>
-        </w:rPr>
-        <w:t xml:space="preserve"> Agile workflows, mobile-first development, responsive design, CRUD architecture</w:t>
-      </w:r>
-    </w:p>
-    <w:p>
-      <w:pPr>
-        <w:pBdr>
-          <w:top w:val="single" w:sz="12" w:space="1" w:color="BFBFBF" w:themeColor="background1" w:themeShade="BF"/>
-        </w:pBdr>
-        <w:spacing w:line="276" w:lineRule="auto"/>
-        <w:rPr>
-          <w:rFonts w:ascii="Arial" w:hAnsi="Arial" w:cs="Arial"/>
-          <w:sz w:val="12"/>
-          <w:szCs w:val="12"/>
-          <w:lang w:val="en-AU"/>
         </w:rPr>
       </w:pPr>
     </w:p>
@@ -752,20 +770,6 @@
     </w:p>
     <w:p>
       <w:pPr>
-        <w:pBdr>
-          <w:top w:val="single" w:sz="12" w:space="1" w:color="BFBFBF" w:themeColor="background1" w:themeShade="BF"/>
-        </w:pBdr>
-        <w:spacing w:line="276" w:lineRule="auto"/>
-        <w:rPr>
-          <w:rFonts w:ascii="Arial" w:hAnsi="Arial" w:cs="Arial"/>
-          <w:sz w:val="12"/>
-          <w:szCs w:val="12"/>
-          <w:lang w:val="en-AU"/>
-        </w:rPr>
-      </w:pPr>
-    </w:p>
-    <w:p>
-      <w:pPr>
         <w:spacing w:after="200"/>
         <w:rPr>
           <w:rFonts w:ascii="Arial" w:hAnsi="Arial" w:cs="Arial"/>
@@ -807,8 +811,7 @@
           <w:szCs w:val="22"/>
           <w:lang w:val="en-AU"/>
         </w:rPr>
-        <w:lastRenderedPageBreak/>
-        <w:t xml:space="preserve">KEY </w:t>
+        <w:t>P</w:t>
       </w:r>
       <w:r>
         <w:rPr>
@@ -818,16 +821,6 @@
           <w:szCs w:val="22"/>
           <w:lang w:val="en-AU"/>
         </w:rPr>
-        <w:t>P</w:t>
-      </w:r>
-      <w:r>
-        <w:rPr>
-          <w:rFonts w:ascii="Arial" w:hAnsi="Arial" w:cs="Arial"/>
-          <w:b/>
-          <w:spacing w:val="60"/>
-          <w:szCs w:val="22"/>
-          <w:lang w:val="en-AU"/>
-        </w:rPr>
         <w:t>ROJECTS</w:t>
       </w:r>
     </w:p>
@@ -852,29 +845,7 @@
           <w:szCs w:val="20"/>
           <w:lang w:val="en-GB"/>
         </w:rPr>
-        <w:t>SPW Photography Studio – Progressive Web App (202</w:t>
-      </w:r>
-      <w:r>
-        <w:rPr>
-          <w:rFonts w:ascii="Arial" w:hAnsi="Arial" w:cs="Arial"/>
-          <w:b/>
-          <w:bCs/>
-          <w:sz w:val="20"/>
-          <w:szCs w:val="20"/>
-          <w:lang w:val="en-GB"/>
-        </w:rPr>
-        <w:t>2</w:t>
-      </w:r>
-      <w:r>
-        <w:rPr>
-          <w:rFonts w:ascii="Arial" w:hAnsi="Arial" w:cs="Arial"/>
-          <w:b/>
-          <w:bCs/>
-          <w:sz w:val="20"/>
-          <w:szCs w:val="20"/>
-          <w:lang w:val="en-GB"/>
-        </w:rPr>
-        <w:t>)</w:t>
+        <w:t>SPW Photography Studio – Progressive Web App</w:t>
       </w:r>
     </w:p>
     <w:p>
@@ -988,29 +959,7 @@
           <w:szCs w:val="20"/>
           <w:lang w:val="en-GB"/>
         </w:rPr>
-        <w:t>DMF Plumbing &amp; Heating – Service Web Application (202</w:t>
-      </w:r>
-      <w:r>
-        <w:rPr>
-          <w:rFonts w:ascii="Arial" w:hAnsi="Arial" w:cs="Arial"/>
-          <w:b/>
-          <w:bCs/>
-          <w:sz w:val="20"/>
-          <w:szCs w:val="20"/>
-          <w:lang w:val="en-GB"/>
-        </w:rPr>
-        <w:t>3</w:t>
-      </w:r>
-      <w:r>
-        <w:rPr>
-          <w:rFonts w:ascii="Arial" w:hAnsi="Arial" w:cs="Arial"/>
-          <w:b/>
-          <w:bCs/>
-          <w:sz w:val="20"/>
-          <w:szCs w:val="20"/>
-          <w:lang w:val="en-GB"/>
-        </w:rPr>
-        <w:t>)</w:t>
+        <w:t>DMF Plumbing &amp; Heating – Service Web Application</w:t>
       </w:r>
     </w:p>
     <w:p>
@@ -1082,7 +1031,7 @@
           <w:szCs w:val="20"/>
           <w:lang w:val="en-GB"/>
         </w:rPr>
-        <w:t>Mary Sewing Workshop – Multilingual Web App (2023)</w:t>
+        <w:t>Mary Sewing Workshop – Multilingual Web App</w:t>
       </w:r>
     </w:p>
     <w:p>
@@ -1154,29 +1103,7 @@
           <w:szCs w:val="20"/>
           <w:lang w:val="en-GB"/>
         </w:rPr>
-        <w:t>Name Day API – REST API Service (202</w:t>
-      </w:r>
-      <w:r>
-        <w:rPr>
-          <w:rFonts w:ascii="Arial" w:hAnsi="Arial" w:cs="Arial"/>
-          <w:b/>
-          <w:bCs/>
-          <w:sz w:val="20"/>
-          <w:szCs w:val="20"/>
-          <w:lang w:val="en-GB"/>
-        </w:rPr>
-        <w:t>4</w:t>
-      </w:r>
-      <w:r>
-        <w:rPr>
-          <w:rFonts w:ascii="Arial" w:hAnsi="Arial" w:cs="Arial"/>
-          <w:b/>
-          <w:bCs/>
-          <w:sz w:val="20"/>
-          <w:szCs w:val="20"/>
-          <w:lang w:val="en-GB"/>
-        </w:rPr>
-        <w:t>)</w:t>
+        <w:t>Name Day API – REST API Service</w:t>
       </w:r>
     </w:p>
     <w:p>
@@ -1248,29 +1175,7 @@
           <w:szCs w:val="20"/>
           <w:lang w:val="en-GB"/>
         </w:rPr>
-        <w:t>FSN – Form Submit Now (Contact Form Tool) (202</w:t>
-      </w:r>
-      <w:r>
-        <w:rPr>
-          <w:rFonts w:ascii="Arial" w:hAnsi="Arial" w:cs="Arial"/>
-          <w:b/>
-          <w:bCs/>
-          <w:sz w:val="20"/>
-          <w:szCs w:val="20"/>
-          <w:lang w:val="en-GB"/>
-        </w:rPr>
-        <w:t>4</w:t>
-      </w:r>
-      <w:r>
-        <w:rPr>
-          <w:rFonts w:ascii="Arial" w:hAnsi="Arial" w:cs="Arial"/>
-          <w:b/>
-          <w:bCs/>
-          <w:sz w:val="20"/>
-          <w:szCs w:val="20"/>
-          <w:lang w:val="en-GB"/>
-        </w:rPr>
-        <w:t>)</w:t>
+        <w:t>FSN – Form Submit Now (Contact Form Tool)</w:t>
       </w:r>
     </w:p>
     <w:p>
@@ -1344,39 +1249,6 @@
         </w:rPr>
         <w:t>Company Directory – Study Project</w:t>
       </w:r>
-      <w:r>
-        <w:rPr>
-          <w:rFonts w:ascii="Arial" w:hAnsi="Arial" w:cs="Arial"/>
-          <w:b/>
-          <w:bCs/>
-          <w:sz w:val="20"/>
-          <w:szCs w:val="20"/>
-          <w:lang w:val="en-GB"/>
-        </w:rPr>
-        <w:t xml:space="preserve"> (202</w:t>
-      </w:r>
-      <w:r>
-        <w:rPr>
-          <w:rFonts w:ascii="Arial" w:hAnsi="Arial" w:cs="Arial"/>
-          <w:b/>
-          <w:bCs/>
-          <w:sz w:val="20"/>
-          <w:szCs w:val="20"/>
-          <w:lang w:val="en-GB"/>
-        </w:rPr>
-        <w:t>5</w:t>
-      </w:r>
-      <w:r>
-        <w:rPr>
-          <w:rFonts w:ascii="Arial" w:hAnsi="Arial" w:cs="Arial"/>
-          <w:b/>
-          <w:bCs/>
-          <w:sz w:val="20"/>
-          <w:szCs w:val="20"/>
-          <w:lang w:val="en-GB"/>
-        </w:rPr>
-        <w:t>)</w:t>
-      </w:r>
     </w:p>
     <w:p>
       <w:pPr>
@@ -1449,39 +1321,6 @@
         </w:rPr>
         <w:t>Gazetteer – Study Project</w:t>
       </w:r>
-      <w:r>
-        <w:rPr>
-          <w:rFonts w:ascii="Arial" w:hAnsi="Arial" w:cs="Arial"/>
-          <w:b/>
-          <w:bCs/>
-          <w:sz w:val="20"/>
-          <w:szCs w:val="20"/>
-          <w:lang w:val="en-GB"/>
-        </w:rPr>
-        <w:t xml:space="preserve"> (202</w:t>
-      </w:r>
-      <w:r>
-        <w:rPr>
-          <w:rFonts w:ascii="Arial" w:hAnsi="Arial" w:cs="Arial"/>
-          <w:b/>
-          <w:bCs/>
-          <w:sz w:val="20"/>
-          <w:szCs w:val="20"/>
-          <w:lang w:val="en-GB"/>
-        </w:rPr>
-        <w:t>5</w:t>
-      </w:r>
-      <w:r>
-        <w:rPr>
-          <w:rFonts w:ascii="Arial" w:hAnsi="Arial" w:cs="Arial"/>
-          <w:b/>
-          <w:bCs/>
-          <w:sz w:val="20"/>
-          <w:szCs w:val="20"/>
-          <w:lang w:val="en-GB"/>
-        </w:rPr>
-        <w:t>)</w:t>
-      </w:r>
     </w:p>
     <w:p>
       <w:pPr>
@@ -1504,39 +1343,8 @@
           <w:szCs w:val="20"/>
           <w:lang w:val="en-GB"/>
         </w:rPr>
-        <w:t>Developed a map-based web application using multiple third-party APIs (</w:t>
-      </w:r>
-      <w:proofErr w:type="spellStart"/>
-      <w:r>
-        <w:rPr>
-          <w:rFonts w:ascii="Arial" w:hAnsi="Arial" w:cs="Arial"/>
-          <w:sz w:val="20"/>
-          <w:szCs w:val="20"/>
-          <w:lang w:val="en-GB"/>
-        </w:rPr>
-        <w:t>Geonames</w:t>
-      </w:r>
-      <w:proofErr w:type="spellEnd"/>
-      <w:r>
-        <w:rPr>
-          <w:rFonts w:ascii="Arial" w:hAnsi="Arial" w:cs="Arial"/>
-          <w:sz w:val="20"/>
-          <w:szCs w:val="20"/>
-          <w:lang w:val="en-GB"/>
-        </w:rPr>
-        <w:t xml:space="preserve">, </w:t>
-      </w:r>
-      <w:proofErr w:type="spellStart"/>
-      <w:r>
-        <w:rPr>
-          <w:rFonts w:ascii="Arial" w:hAnsi="Arial" w:cs="Arial"/>
-          <w:sz w:val="20"/>
-          <w:szCs w:val="20"/>
-          <w:lang w:val="en-GB"/>
-        </w:rPr>
-        <w:t>OpenWeather</w:t>
-      </w:r>
-      <w:proofErr w:type="spellEnd"/>
+        <w:t>Developed a map-based web application using multiple third-party APIs (Geonames, OpenWeather</w:t>
+      </w:r>
       <w:r>
         <w:rPr>
           <w:rFonts w:ascii="Arial" w:hAnsi="Arial" w:cs="Arial"/>
@@ -1582,15 +1390,12 @@
     </w:p>
     <w:p>
       <w:pPr>
-        <w:pBdr>
-          <w:top w:val="single" w:sz="12" w:space="1" w:color="BFBFBF" w:themeColor="background1" w:themeShade="BF"/>
-        </w:pBdr>
-        <w:spacing w:line="276" w:lineRule="auto"/>
-        <w:rPr>
-          <w:rFonts w:ascii="Arial" w:hAnsi="Arial" w:cs="Arial"/>
-          <w:sz w:val="12"/>
-          <w:szCs w:val="12"/>
-          <w:lang w:val="en-AU"/>
+        <w:spacing w:after="120"/>
+        <w:rPr>
+          <w:rFonts w:ascii="Arial" w:hAnsi="Arial" w:cs="Arial"/>
+          <w:sz w:val="20"/>
+          <w:szCs w:val="20"/>
+          <w:lang w:val="en-GB"/>
         </w:rPr>
       </w:pPr>
     </w:p>
@@ -1934,89 +1739,6 @@
           <w:lang w:val="en-AU"/>
         </w:rPr>
         <w:t xml:space="preserve"> (2003)</w:t>
-      </w:r>
-    </w:p>
-    <w:p>
-      <w:pPr>
-        <w:pBdr>
-          <w:top w:val="single" w:sz="12" w:space="1" w:color="BFBFBF" w:themeColor="background1" w:themeShade="BF"/>
-        </w:pBdr>
-        <w:spacing w:line="276" w:lineRule="auto"/>
-        <w:rPr>
-          <w:rFonts w:ascii="Arial" w:hAnsi="Arial" w:cs="Arial"/>
-          <w:sz w:val="12"/>
-          <w:szCs w:val="12"/>
-          <w:lang w:val="en-AU"/>
-        </w:rPr>
-      </w:pPr>
-    </w:p>
-    <w:p>
-      <w:pPr>
-        <w:spacing w:after="200"/>
-        <w:rPr>
-          <w:rFonts w:ascii="Arial" w:hAnsi="Arial" w:cs="Arial"/>
-          <w:b/>
-          <w:spacing w:val="60"/>
-          <w:szCs w:val="22"/>
-          <w:lang w:val="en-AU"/>
-        </w:rPr>
-      </w:pPr>
-      <w:r>
-        <w:rPr>
-          <w:rFonts w:ascii="Arial" w:hAnsi="Arial" w:cs="Arial"/>
-          <w:b/>
-          <w:spacing w:val="60"/>
-          <w:szCs w:val="22"/>
-          <w:lang w:val="en-AU"/>
-        </w:rPr>
-        <w:t>ADDITIONAL INFORMATION</w:t>
-      </w:r>
-    </w:p>
-    <w:p>
-      <w:pPr>
-        <w:numPr>
-          <w:ilvl w:val="0"/>
-          <w:numId w:val="3"/>
-        </w:numPr>
-        <w:spacing w:after="120"/>
-        <w:rPr>
-          <w:rFonts w:ascii="Arial" w:hAnsi="Arial" w:cs="Arial"/>
-          <w:sz w:val="20"/>
-          <w:szCs w:val="20"/>
-          <w:lang w:val="en-GB"/>
-        </w:rPr>
-      </w:pPr>
-      <w:r>
-        <w:rPr>
-          <w:rFonts w:ascii="Arial" w:hAnsi="Arial" w:cs="Arial"/>
-          <w:sz w:val="20"/>
-          <w:szCs w:val="20"/>
-          <w:lang w:val="en-GB"/>
-        </w:rPr>
-        <w:t>Eligible to work in the UK</w:t>
-      </w:r>
-    </w:p>
-    <w:p>
-      <w:pPr>
-        <w:numPr>
-          <w:ilvl w:val="0"/>
-          <w:numId w:val="3"/>
-        </w:numPr>
-        <w:spacing w:after="120"/>
-        <w:rPr>
-          <w:rFonts w:ascii="Arial" w:hAnsi="Arial" w:cs="Arial"/>
-          <w:sz w:val="20"/>
-          <w:szCs w:val="20"/>
-        </w:rPr>
-      </w:pPr>
-      <w:r>
-        <w:rPr>
-          <w:rFonts w:ascii="Arial" w:hAnsi="Arial" w:cs="Arial"/>
-          <w:sz w:val="20"/>
-          <w:szCs w:val="20"/>
-          <w:lang w:val="en-GB"/>
-        </w:rPr>
-        <w:t>Available for full-time, contract, or freelance roles</w:t>
       </w:r>
     </w:p>
     <w:sectPr>

</xml_diff>

<commit_message>
Add React to stack
</commit_message>
<xml_diff>
--- a/src/assets/documents/cv/myCV_v8.docx
+++ b/src/assets/documents/cv/myCV_v8.docx
@@ -311,15 +311,33 @@
           <w:sz w:val="20"/>
           <w:szCs w:val="20"/>
         </w:rPr>
-        <w:t xml:space="preserve">Frontend: </w:t>
-      </w:r>
-      <w:r>
-        <w:rPr>
-          <w:rFonts w:ascii="Arial" w:hAnsi="Arial" w:cs="Arial"/>
-          <w:sz w:val="20"/>
-          <w:szCs w:val="20"/>
-        </w:rPr>
-        <w:t>Redux, Next.js, TypeScript, JavaScript, HTML, CSS, Sass</w:t>
+        <w:t>Frontend:</w:t>
+      </w:r>
+      <w:r>
+        <w:rPr>
+          <w:rFonts w:ascii="Arial" w:hAnsi="Arial" w:cs="Arial"/>
+          <w:b/>
+          <w:bCs/>
+          <w:sz w:val="20"/>
+          <w:szCs w:val="20"/>
+        </w:rPr>
+        <w:t xml:space="preserve"> </w:t>
+      </w:r>
+      <w:r>
+        <w:rPr>
+          <w:rFonts w:ascii="Arial" w:hAnsi="Arial" w:cs="Arial"/>
+          <w:sz w:val="20"/>
+          <w:szCs w:val="20"/>
+        </w:rPr>
+        <w:t>React, R</w:t>
+      </w:r>
+      <w:r>
+        <w:rPr>
+          <w:rFonts w:ascii="Arial" w:hAnsi="Arial" w:cs="Arial"/>
+          <w:sz w:val="20"/>
+          <w:szCs w:val="20"/>
+        </w:rPr>
+        <w:t>edux, Next.js, TypeScript, JavaScript, HTML, CSS, Sass</w:t>
       </w:r>
     </w:p>
     <w:p>

</xml_diff>

<commit_message>
Add Lorry Tracking App project to the CV doc
</commit_message>
<xml_diff>
--- a/src/assets/documents/cv/myCV_v8.docx
+++ b/src/assets/documents/cv/myCV_v8.docx
@@ -896,7 +896,7 @@
           <w:szCs w:val="20"/>
           <w:lang w:val="en-GB"/>
         </w:rPr>
-        <w:t>SPW Photography Studio – Progressive Web App</w:t>
+        <w:t>Real-Time Lorry Tracking System – Full-Stack Web Application (In Progress)</w:t>
       </w:r>
     </w:p>
     <w:p>
@@ -920,7 +920,7 @@
           <w:szCs w:val="20"/>
           <w:lang w:val="en-GB"/>
         </w:rPr>
-        <w:t>Built a fully responsive Progressive Web App using React, Node.js, and Sass.</w:t>
+        <w:t>Designing and developing a real-time vehicle tracking system to monitor lorries from check-in to check-out on a busy production site.</w:t>
       </w:r>
     </w:p>
     <w:p>
@@ -944,7 +944,7 @@
           <w:szCs w:val="20"/>
           <w:lang w:val="en-GB"/>
         </w:rPr>
-        <w:t>Implemented dynamic image galleries, service pages, testimonials, and session-booking contact form.</w:t>
+        <w:t>Implementing status-based workflow tracking (waiting, loading, completed) with timestamp logging and role-based access control.</w:t>
       </w:r>
     </w:p>
     <w:p>
@@ -968,6 +968,150 @@
           <w:szCs w:val="20"/>
           <w:lang w:val="en-GB"/>
         </w:rPr>
+        <w:t>Building alert functionality to monitor two-hour turnaround compliance and reduce operational delays.</w:t>
+      </w:r>
+    </w:p>
+    <w:p>
+      <w:pPr>
+        <w:numPr>
+          <w:ilvl w:val="0"/>
+          <w:numId w:val="4"/>
+        </w:numPr>
+        <w:spacing w:after="120"/>
+        <w:rPr>
+          <w:rFonts w:ascii="Arial" w:hAnsi="Arial" w:cs="Arial"/>
+          <w:sz w:val="20"/>
+          <w:szCs w:val="20"/>
+          <w:lang w:val="en-GB"/>
+        </w:rPr>
+      </w:pPr>
+      <w:r>
+        <w:rPr>
+          <w:rFonts w:ascii="Arial" w:hAnsi="Arial" w:cs="Arial"/>
+          <w:sz w:val="20"/>
+          <w:szCs w:val="20"/>
+          <w:lang w:val="en-GB"/>
+        </w:rPr>
+        <w:t>Providing reporting, statistics, and historical data to improve visibility and decision-making.</w:t>
+      </w:r>
+    </w:p>
+    <w:p>
+      <w:pPr>
+        <w:numPr>
+          <w:ilvl w:val="0"/>
+          <w:numId w:val="4"/>
+        </w:numPr>
+        <w:spacing w:after="120"/>
+        <w:rPr>
+          <w:rFonts w:ascii="Arial" w:hAnsi="Arial" w:cs="Arial"/>
+          <w:sz w:val="20"/>
+          <w:szCs w:val="20"/>
+          <w:lang w:val="en-GB"/>
+        </w:rPr>
+      </w:pPr>
+      <w:r>
+        <w:rPr>
+          <w:rFonts w:ascii="Arial" w:hAnsi="Arial" w:cs="Arial"/>
+          <w:sz w:val="20"/>
+          <w:szCs w:val="20"/>
+          <w:lang w:val="en-GB"/>
+        </w:rPr>
+        <w:t>Focused on solving a real operational problem by reducing manual updates and improving on-site communication.</w:t>
+      </w:r>
+    </w:p>
+    <w:p>
+      <w:pPr>
+        <w:spacing w:after="120"/>
+        <w:rPr>
+          <w:rFonts w:ascii="Arial" w:hAnsi="Arial" w:cs="Arial"/>
+          <w:b/>
+          <w:bCs/>
+          <w:sz w:val="20"/>
+          <w:szCs w:val="20"/>
+          <w:lang w:val="en-GB"/>
+        </w:rPr>
+      </w:pPr>
+      <w:r>
+        <w:rPr>
+          <w:rFonts w:ascii="Arial" w:hAnsi="Arial" w:cs="Arial"/>
+          <w:b/>
+          <w:bCs/>
+          <w:sz w:val="20"/>
+          <w:szCs w:val="20"/>
+          <w:lang w:val="en-GB"/>
+        </w:rPr>
+        <w:t>SPW Photography Studio – Progressive Web App</w:t>
+      </w:r>
+    </w:p>
+    <w:p>
+      <w:pPr>
+        <w:numPr>
+          <w:ilvl w:val="0"/>
+          <w:numId w:val="4"/>
+        </w:numPr>
+        <w:spacing w:after="120"/>
+        <w:rPr>
+          <w:rFonts w:ascii="Arial" w:hAnsi="Arial" w:cs="Arial"/>
+          <w:sz w:val="20"/>
+          <w:szCs w:val="20"/>
+          <w:lang w:val="en-GB"/>
+        </w:rPr>
+      </w:pPr>
+      <w:r>
+        <w:rPr>
+          <w:rFonts w:ascii="Arial" w:hAnsi="Arial" w:cs="Arial"/>
+          <w:sz w:val="20"/>
+          <w:szCs w:val="20"/>
+          <w:lang w:val="en-GB"/>
+        </w:rPr>
+        <w:t>Built a fully responsive Progressive Web App using React, Node.js, and Sass.</w:t>
+      </w:r>
+    </w:p>
+    <w:p>
+      <w:pPr>
+        <w:numPr>
+          <w:ilvl w:val="0"/>
+          <w:numId w:val="4"/>
+        </w:numPr>
+        <w:spacing w:after="120"/>
+        <w:rPr>
+          <w:rFonts w:ascii="Arial" w:hAnsi="Arial" w:cs="Arial"/>
+          <w:sz w:val="20"/>
+          <w:szCs w:val="20"/>
+          <w:lang w:val="en-GB"/>
+        </w:rPr>
+      </w:pPr>
+      <w:r>
+        <w:rPr>
+          <w:rFonts w:ascii="Arial" w:hAnsi="Arial" w:cs="Arial"/>
+          <w:sz w:val="20"/>
+          <w:szCs w:val="20"/>
+          <w:lang w:val="en-GB"/>
+        </w:rPr>
+        <w:t>Implemented dynamic image galleries, service pages, testimonials, and session-booking contact form.</w:t>
+      </w:r>
+    </w:p>
+    <w:p>
+      <w:pPr>
+        <w:numPr>
+          <w:ilvl w:val="0"/>
+          <w:numId w:val="4"/>
+        </w:numPr>
+        <w:spacing w:after="120"/>
+        <w:rPr>
+          <w:rFonts w:ascii="Arial" w:hAnsi="Arial" w:cs="Arial"/>
+          <w:sz w:val="20"/>
+          <w:szCs w:val="20"/>
+          <w:lang w:val="en-GB"/>
+        </w:rPr>
+      </w:pPr>
+      <w:r>
+        <w:rPr>
+          <w:rFonts w:ascii="Arial" w:hAnsi="Arial" w:cs="Arial"/>
+          <w:sz w:val="20"/>
+          <w:szCs w:val="20"/>
+          <w:lang w:val="en-GB"/>
+        </w:rPr>
         <w:t>Optimised performance for fast loading</w:t>
       </w:r>
       <w:r>
@@ -1394,8 +1538,39 @@
           <w:szCs w:val="20"/>
           <w:lang w:val="en-GB"/>
         </w:rPr>
-        <w:t>Developed a map-based web application using multiple third-party APIs (Geonames, OpenWeather</w:t>
-      </w:r>
+        <w:t>Developed a map-based web application using multiple third-party APIs (</w:t>
+      </w:r>
+      <w:proofErr w:type="spellStart"/>
+      <w:r>
+        <w:rPr>
+          <w:rFonts w:ascii="Arial" w:hAnsi="Arial" w:cs="Arial"/>
+          <w:sz w:val="20"/>
+          <w:szCs w:val="20"/>
+          <w:lang w:val="en-GB"/>
+        </w:rPr>
+        <w:t>Geonames</w:t>
+      </w:r>
+      <w:proofErr w:type="spellEnd"/>
+      <w:r>
+        <w:rPr>
+          <w:rFonts w:ascii="Arial" w:hAnsi="Arial" w:cs="Arial"/>
+          <w:sz w:val="20"/>
+          <w:szCs w:val="20"/>
+          <w:lang w:val="en-GB"/>
+        </w:rPr>
+        <w:t xml:space="preserve">, </w:t>
+      </w:r>
+      <w:proofErr w:type="spellStart"/>
+      <w:r>
+        <w:rPr>
+          <w:rFonts w:ascii="Arial" w:hAnsi="Arial" w:cs="Arial"/>
+          <w:sz w:val="20"/>
+          <w:szCs w:val="20"/>
+          <w:lang w:val="en-GB"/>
+        </w:rPr>
+        <w:t>OpenWeather</w:t>
+      </w:r>
+      <w:proofErr w:type="spellEnd"/>
       <w:r>
         <w:rPr>
           <w:rFonts w:ascii="Arial" w:hAnsi="Arial" w:cs="Arial"/>
@@ -1452,6 +1627,17 @@
     </w:p>
     <w:p>
       <w:pPr>
+        <w:spacing w:after="120"/>
+        <w:rPr>
+          <w:rFonts w:ascii="Arial" w:hAnsi="Arial" w:cs="Arial"/>
+          <w:sz w:val="20"/>
+          <w:szCs w:val="20"/>
+          <w:lang w:val="en-GB"/>
+        </w:rPr>
+      </w:pPr>
+    </w:p>
+    <w:p>
+      <w:pPr>
         <w:spacing w:after="200"/>
         <w:rPr>
           <w:rFonts w:ascii="Arial" w:hAnsi="Arial" w:cs="Arial"/>
@@ -1469,6 +1655,7 @@
           <w:szCs w:val="22"/>
           <w:lang w:val="en-AU"/>
         </w:rPr>
+        <w:lastRenderedPageBreak/>
         <w:t>ED</w:t>
       </w:r>
       <w:r>
@@ -4022,7 +4209,6 @@
   <w:style w:type="character" w:default="1" w:styleId="DefaultParagraphFont">
     <w:name w:val="Default Paragraph Font"/>
     <w:uiPriority w:val="1"/>
-    <w:semiHidden/>
     <w:unhideWhenUsed/>
   </w:style>
   <w:style w:type="table" w:default="1" w:styleId="TableNormal">

</xml_diff>

<commit_message>
update: CV second line update, TS added
</commit_message>
<xml_diff>
--- a/src/assets/documents/cv/myCV_v8.docx
+++ b/src/assets/documents/cv/myCV_v8.docx
@@ -59,7 +59,47 @@
           <w:b/>
           <w:bCs/>
         </w:rPr>
-        <w:t>React &amp; Node.js</w:t>
+        <w:t xml:space="preserve">React </w:t>
+      </w:r>
+      <w:r>
+        <w:rPr>
+          <w:rFonts w:ascii="Arial" w:hAnsi="Arial" w:cs="Arial"/>
+          <w:b/>
+          <w:bCs/>
+        </w:rPr>
+        <w:t xml:space="preserve">| </w:t>
+      </w:r>
+      <w:r>
+        <w:rPr>
+          <w:rFonts w:ascii="Arial" w:hAnsi="Arial" w:cs="Arial"/>
+          <w:b/>
+          <w:bCs/>
+        </w:rPr>
+        <w:t>Next.js</w:t>
+      </w:r>
+      <w:r>
+        <w:rPr>
+          <w:rFonts w:ascii="Arial" w:hAnsi="Arial" w:cs="Arial"/>
+          <w:b/>
+          <w:bCs/>
+        </w:rPr>
+        <w:t xml:space="preserve"> |</w:t>
+      </w:r>
+      <w:r>
+        <w:rPr>
+          <w:rFonts w:ascii="Arial" w:hAnsi="Arial" w:cs="Arial"/>
+          <w:b/>
+          <w:bCs/>
+        </w:rPr>
+        <w:t xml:space="preserve"> Node.js</w:t>
+      </w:r>
+      <w:r>
+        <w:rPr>
+          <w:rFonts w:ascii="Arial" w:hAnsi="Arial" w:cs="Arial"/>
+          <w:b/>
+          <w:bCs/>
+        </w:rPr>
+        <w:t xml:space="preserve"> | TypeScript</w:t>
       </w:r>
     </w:p>
     <w:p>
@@ -4209,6 +4249,7 @@
   <w:style w:type="character" w:default="1" w:styleId="DefaultParagraphFont">
     <w:name w:val="Default Paragraph Font"/>
     <w:uiPriority w:val="1"/>
+    <w:semiHidden/>
     <w:unhideWhenUsed/>
   </w:style>
   <w:style w:type="table" w:default="1" w:styleId="TableNormal">

</xml_diff>

<commit_message>
Resume update, job title updated
</commit_message>
<xml_diff>
--- a/src/assets/documents/cv/myCV_v8.docx
+++ b/src/assets/documents/cv/myCV_v8.docx
@@ -561,9 +561,8 @@
           <w:bCs/>
           <w:sz w:val="20"/>
           <w:szCs w:val="20"/>
-          <w:lang w:val="en-GB"/>
-        </w:rPr>
-        <w:t>Full-Stack Web Developer</w:t>
+        </w:rPr>
+        <w:t>Freelance Full-Stack Developer (Project-Based)</w:t>
       </w:r>
       <w:r>
         <w:rPr>
@@ -583,7 +582,16 @@
           <w:szCs w:val="20"/>
           <w:lang w:val="en-GB"/>
         </w:rPr>
-        <w:t>Self-Employed / Contract | 2022 – 2025</w:t>
+        <w:t xml:space="preserve">Self-Employed / Contract | 2022 – </w:t>
+      </w:r>
+      <w:r>
+        <w:rPr>
+          <w:rFonts w:ascii="Arial" w:hAnsi="Arial" w:cs="Arial"/>
+          <w:sz w:val="20"/>
+          <w:szCs w:val="20"/>
+          <w:lang w:val="en-GB"/>
+        </w:rPr>
+        <w:t>present</w:t>
       </w:r>
     </w:p>
     <w:p>
@@ -607,7 +615,7 @@
           <w:szCs w:val="20"/>
           <w:lang w:val="en-GB"/>
         </w:rPr>
-        <w:t xml:space="preserve">Designed, developed, and deployed scalable full-stack web applications using React, Next.js, TypeScript, Node.js, and Express.js. </w:t>
+        <w:t>Working on independent and client projects alongside ongoing professional development.</w:t>
       </w:r>
     </w:p>
     <w:p>
@@ -631,7 +639,7 @@
           <w:szCs w:val="20"/>
           <w:lang w:val="en-GB"/>
         </w:rPr>
-        <w:t xml:space="preserve">Built responsive, mobile-first user interfaces using HTML, CSS, and Sass, ensuring cross-browser compatibility and performance. </w:t>
+        <w:t xml:space="preserve">Designed, developed, and deployed scalable full-stack web applications using React, Next.js, TypeScript, Node.js, and Express.js. </w:t>
       </w:r>
     </w:p>
     <w:p>
@@ -655,7 +663,7 @@
           <w:szCs w:val="20"/>
           <w:lang w:val="en-GB"/>
         </w:rPr>
-        <w:t xml:space="preserve">Managed global state and complex UI interactions using Redux in data-driven applications. </w:t>
+        <w:t xml:space="preserve">Built responsive, mobile-first user interfaces using HTML, CSS, and Sass, ensuring cross-browser compatibility and performance. </w:t>
       </w:r>
     </w:p>
     <w:p>
@@ -679,7 +687,7 @@
           <w:szCs w:val="20"/>
           <w:lang w:val="en-GB"/>
         </w:rPr>
-        <w:t xml:space="preserve">Developed RESTful APIs and backend services, integrating PostgreSQL and MongoDB for efficient data storage and retrieval. </w:t>
+        <w:t xml:space="preserve">Managed global state and complex UI interactions using Redux in data-driven applications. </w:t>
       </w:r>
     </w:p>
     <w:p>
@@ -703,7 +711,7 @@
           <w:szCs w:val="20"/>
           <w:lang w:val="en-GB"/>
         </w:rPr>
-        <w:t xml:space="preserve">Implemented backend features and scripting using Node.js and Python where appropriate. </w:t>
+        <w:t xml:space="preserve">Developed RESTful APIs and backend services, integrating PostgreSQL and MongoDB for efficient data storage and retrieval. </w:t>
       </w:r>
     </w:p>
     <w:p>
@@ -727,7 +735,7 @@
           <w:szCs w:val="20"/>
           <w:lang w:val="en-GB"/>
         </w:rPr>
-        <w:t xml:space="preserve">Set up version control and automated workflows using Git, GitHub, and GitHub Actions (CI/CD) to streamline development and deployment. </w:t>
+        <w:t xml:space="preserve">Implemented backend features and scripting using Node.js and Python where appropriate. </w:t>
       </w:r>
     </w:p>
     <w:p>
@@ -751,7 +759,7 @@
           <w:szCs w:val="20"/>
           <w:lang w:val="en-GB"/>
         </w:rPr>
-        <w:t xml:space="preserve">Translated client requirements into secure, maintainable, and high-performance solutions through iterative development. </w:t>
+        <w:t xml:space="preserve">Set up version control and automated workflows using Git, GitHub, and GitHub Actions (CI/CD) to streamline development and deployment. </w:t>
       </w:r>
     </w:p>
     <w:p>
@@ -775,6 +783,30 @@
           <w:szCs w:val="20"/>
           <w:lang w:val="en-GB"/>
         </w:rPr>
+        <w:t xml:space="preserve">Translated client requirements into secure, maintainable, and high-performance solutions through iterative development. </w:t>
+      </w:r>
+    </w:p>
+    <w:p>
+      <w:pPr>
+        <w:numPr>
+          <w:ilvl w:val="0"/>
+          <w:numId w:val="4"/>
+        </w:numPr>
+        <w:spacing w:after="120"/>
+        <w:rPr>
+          <w:rFonts w:ascii="Arial" w:hAnsi="Arial" w:cs="Arial"/>
+          <w:sz w:val="20"/>
+          <w:szCs w:val="20"/>
+          <w:lang w:val="en-GB"/>
+        </w:rPr>
+      </w:pPr>
+      <w:r>
+        <w:rPr>
+          <w:rFonts w:ascii="Arial" w:hAnsi="Arial" w:cs="Arial"/>
+          <w:sz w:val="20"/>
+          <w:szCs w:val="20"/>
+          <w:lang w:val="en-GB"/>
+        </w:rPr>
         <w:t>Managed projects end-to-end, from system design and development to deployment and ongoing maintenance.</w:t>
       </w:r>
     </w:p>
@@ -809,7 +841,6 @@
           <w:szCs w:val="22"/>
           <w:lang w:val="en-AU"/>
         </w:rPr>
-        <w:lastRenderedPageBreak/>
         <w:t>P</w:t>
       </w:r>
       <w:r>

</xml_diff>